<commit_message>
Unit 3 lessons 3.02–3.04 built; deck guards (off-slide, footer), superscript runs, heading rules
Co-Authored-By: Claude Fable 5.1 <noreply@anthropic.com>
</commit_message>
<xml_diff>
--- a/a7/build/out/u3/A7 3.01  Teacher Edition.docx
+++ b/a7/build/out/u3/A7 3.01  Teacher Edition.docx
@@ -229,7 +229,26 @@
           <w:color w:val="1A1A1A"/>
           <w:sz w:val="21"/>
         </w:rPr>
-        <w:t>·2ⁿ = 2</w:t>
+        <w:t>·2</w:t>
+      </w:r>
+      <w:r>
+        <w:rPr>
+          <w:b w:val="0"/>
+          <w:i w:val="0"/>
+          <w:color w:val="1A1A1A"/>
+          <w:sz w:val="21"/>
+          <w:vertAlign w:val="superscript"/>
+        </w:rPr>
+        <w:t>n</w:t>
+      </w:r>
+      <w:r>
+        <w:rPr>
+          <w:b w:val="0"/>
+          <w:i w:val="0"/>
+          <w:color w:val="1A1A1A"/>
+          <w:sz w:val="21"/>
+        </w:rPr>
+        <w:t xml:space="preserve"> = 2</w:t>
       </w:r>
       <w:r>
         <w:rPr>

</xml_diff>